<commit_message>
Projects: add InputKit/KAJ images, reorder by date, update AlphaSwap period; update CV files
</commit_message>
<xml_diff>
--- a/public/cv/jorie-2025.docx
+++ b/public/cv/jorie-2025.docx
@@ -206,14 +206,6 @@
     <w:p>
       <w:pPr>
         <w:pStyle w:val="Heading2"/>
-      </w:pPr>
-      <w:r>
-        <w:t>Core Skills</w:t>
-      </w:r>
-      <w:r>
-        <w:br/>
-      </w:r>
-      <w:r>
         <w:rPr>
           <w:b w:val="0"/>
           <w:bCs w:val="0"/>
@@ -221,7 +213,12 @@
           <w:sz w:val="22"/>
           <w:szCs w:val="22"/>
         </w:rPr>
-        <w:t xml:space="preserve"> </w:t>
+      </w:pPr>
+      <w:r>
+        <w:t>Core Skills</w:t>
+      </w:r>
+      <w:r>
+        <w:br/>
       </w:r>
       <w:r>
         <w:rPr>
@@ -231,9 +228,16 @@
           <w:sz w:val="22"/>
           <w:szCs w:val="22"/>
         </w:rPr>
-        <w:t xml:space="preserve">JavaScript (React.js, Next.js, Vue.js, Angular), TypeScript, HTML5, CSS3, </w:t>
-      </w:r>
-      <w:proofErr w:type="spellStart"/>
+        <w:t xml:space="preserve"> </w:t>
+      </w:r>
+      <w:r>
+        <w:rPr>
+          <w:color w:val="000000" w:themeColor="text1"/>
+          <w:sz w:val="22"/>
+          <w:szCs w:val="22"/>
+        </w:rPr>
+        <w:t>Frontend</w:t>
+      </w:r>
       <w:r>
         <w:rPr>
           <w:b w:val="0"/>
@@ -242,9 +246,9 @@
           <w:sz w:val="22"/>
           <w:szCs w:val="22"/>
         </w:rPr>
-        <w:t>TailwindCSS</w:t>
-      </w:r>
-      <w:proofErr w:type="spellEnd"/>
+        <w:t xml:space="preserve">: JavaScript (React.js, Next.js, Vue.js, Angular), TypeScript, </w:t>
+      </w:r>
+      <w:proofErr w:type="spellStart"/>
       <w:r>
         <w:rPr>
           <w:b w:val="0"/>
@@ -253,9 +257,9 @@
           <w:sz w:val="22"/>
           <w:szCs w:val="22"/>
         </w:rPr>
-        <w:t xml:space="preserve">, </w:t>
-      </w:r>
-      <w:proofErr w:type="spellStart"/>
+        <w:t>TailwindCSS</w:t>
+      </w:r>
+      <w:proofErr w:type="spellEnd"/>
       <w:r>
         <w:rPr>
           <w:b w:val="0"/>
@@ -264,10 +268,13 @@
           <w:sz w:val="22"/>
           <w:szCs w:val="22"/>
         </w:rPr>
-        <w:t>DaisyUI</w:t>
-      </w:r>
-      <w:proofErr w:type="spellEnd"/>
-      <w:r>
+        <w:t>, Storybook</w:t>
+      </w:r>
+    </w:p>
+    <w:p>
+      <w:pPr>
+        <w:pStyle w:val="Heading2"/>
+        <w:spacing w:before="0"/>
         <w:rPr>
           <w:b w:val="0"/>
           <w:bCs w:val="0"/>
@@ -275,9 +282,7 @@
           <w:sz w:val="22"/>
           <w:szCs w:val="22"/>
         </w:rPr>
-        <w:t xml:space="preserve">, Storybook, API Integration, Node.js, Python (Django, </w:t>
-      </w:r>
-      <w:proofErr w:type="spellStart"/>
+      </w:pPr>
       <w:r>
         <w:rPr>
           <w:b w:val="0"/>
@@ -286,9 +291,16 @@
           <w:sz w:val="22"/>
           <w:szCs w:val="22"/>
         </w:rPr>
-        <w:t>FastAPI</w:t>
-      </w:r>
-      <w:proofErr w:type="spellEnd"/>
+        <w:t xml:space="preserve"> </w:t>
+      </w:r>
+      <w:r>
+        <w:rPr>
+          <w:color w:val="000000" w:themeColor="text1"/>
+          <w:sz w:val="22"/>
+          <w:szCs w:val="22"/>
+        </w:rPr>
+        <w:t>Backend</w:t>
+      </w:r>
       <w:r>
         <w:rPr>
           <w:b w:val="0"/>
@@ -297,8 +309,9 @@
           <w:sz w:val="22"/>
           <w:szCs w:val="22"/>
         </w:rPr>
-        <w:t>), PHP (Laravel, Yii)</w:t>
-      </w:r>
+        <w:t xml:space="preserve">: Node.js, Python (Django, </w:t>
+      </w:r>
+      <w:proofErr w:type="spellStart"/>
       <w:r>
         <w:rPr>
           <w:b w:val="0"/>
@@ -307,7 +320,18 @@
           <w:sz w:val="22"/>
           <w:szCs w:val="22"/>
         </w:rPr>
-        <w:t>, Java</w:t>
+        <w:t>FastAPI</w:t>
+      </w:r>
+      <w:proofErr w:type="spellEnd"/>
+      <w:r>
+        <w:rPr>
+          <w:b w:val="0"/>
+          <w:bCs w:val="0"/>
+          <w:color w:val="000000" w:themeColor="text1"/>
+          <w:sz w:val="22"/>
+          <w:szCs w:val="22"/>
+        </w:rPr>
+        <w:t>), PHP (Laravel, Yii), Java (Spring Boot)</w:t>
       </w:r>
     </w:p>
     <w:p>
@@ -323,27 +347,51 @@
         <w:rPr>
           <w:color w:val="000000" w:themeColor="text1"/>
         </w:rPr>
-        <w:t>Git,</w:t>
-      </w:r>
-      <w:r>
-        <w:rPr>
-          <w:color w:val="000000" w:themeColor="text1"/>
-        </w:rPr>
-        <w:t xml:space="preserve"> </w:t>
-      </w:r>
-      <w:r>
-        <w:rPr>
-          <w:color w:val="000000" w:themeColor="text1"/>
-        </w:rPr>
-        <w:t xml:space="preserve">MongoDB, PostgreSQL, SQL, AWS (ECS, Lambda, RDS, S3), Jenkins, GitHub Actions Webpack, Docker, Microservices, RESTful APIs, </w:t>
+        <w:t>AWS (ECS, Lambda, RDS, S3), Google Cloud, Azure</w:t>
+      </w:r>
+      <w:r>
+        <w:rPr>
+          <w:color w:val="000000" w:themeColor="text1"/>
+        </w:rPr>
+        <w:t xml:space="preserve">, </w:t>
+      </w:r>
+      <w:r>
+        <w:rPr>
+          <w:color w:val="000000" w:themeColor="text1"/>
+        </w:rPr>
+        <w:t>Docker, Kubernetes, Jenkins, GitHub Actions</w:t>
+      </w:r>
+      <w:r>
+        <w:t xml:space="preserve">, </w:t>
+      </w:r>
+      <w:r>
+        <w:t>Terraform, Ansible</w:t>
+      </w:r>
+      <w:r>
+        <w:t xml:space="preserve">, </w:t>
+      </w:r>
+      <w:r>
+        <w:t>TensorFlow</w:t>
+      </w:r>
+      <w:r>
+        <w:t xml:space="preserve">, </w:t>
+      </w:r>
+      <w:r>
+        <w:t xml:space="preserve">OpenAI (GPT models), </w:t>
       </w:r>
       <w:proofErr w:type="spellStart"/>
       <w:r>
-        <w:t>GraphQL</w:t>
+        <w:t>SpaCy</w:t>
       </w:r>
       <w:proofErr w:type="spellEnd"/>
       <w:r>
-        <w:t xml:space="preserve">, OAuth/JWT Authentication, Azure, Google Cloud, Blockchain Integrations (Solidity, Hyperledger), </w:t>
+        <w:t>, Hugging Face</w:t>
+      </w:r>
+      <w:r>
+        <w:t xml:space="preserve">, </w:t>
+      </w:r>
+      <w:r>
+        <w:t>Pandas, NumPy, Matplotlib</w:t>
       </w:r>
     </w:p>
     <w:p>
@@ -420,11 +468,21 @@
         <w:rPr>
           <w:color w:val="000000" w:themeColor="text1"/>
         </w:rPr>
-        <w:t xml:space="preserve">- Led the development of frontend (Next.js, </w:t>
+        <w:t>- Led the development of frontend (</w:t>
+      </w:r>
+      <w:r>
+        <w:rPr>
+          <w:b/>
+          <w:bCs/>
+          <w:color w:val="000000" w:themeColor="text1"/>
+        </w:rPr>
+        <w:t xml:space="preserve">Next.js, </w:t>
       </w:r>
       <w:proofErr w:type="spellStart"/>
       <w:r>
         <w:rPr>
+          <w:b/>
+          <w:bCs/>
           <w:color w:val="000000" w:themeColor="text1"/>
         </w:rPr>
         <w:t>DaisyUI</w:t>
@@ -432,6 +490,8 @@
       <w:proofErr w:type="spellEnd"/>
       <w:r>
         <w:rPr>
+          <w:b/>
+          <w:bCs/>
           <w:color w:val="000000" w:themeColor="text1"/>
         </w:rPr>
         <w:t xml:space="preserve">, </w:t>
@@ -439,6 +499,8 @@
       <w:proofErr w:type="spellStart"/>
       <w:r>
         <w:rPr>
+          <w:b/>
+          <w:bCs/>
           <w:color w:val="000000" w:themeColor="text1"/>
         </w:rPr>
         <w:t>GraphQL</w:t>
@@ -446,6 +508,8 @@
       <w:proofErr w:type="spellEnd"/>
       <w:r>
         <w:rPr>
+          <w:b/>
+          <w:bCs/>
           <w:color w:val="000000" w:themeColor="text1"/>
         </w:rPr>
         <w:t xml:space="preserve">, </w:t>
@@ -453,6 +517,8 @@
       <w:proofErr w:type="spellStart"/>
       <w:r>
         <w:rPr>
+          <w:b/>
+          <w:bCs/>
           <w:color w:val="000000" w:themeColor="text1"/>
         </w:rPr>
         <w:t>TailwindCSS</w:t>
@@ -469,11 +535,27 @@
           <w:color w:val="000000" w:themeColor="text1"/>
         </w:rPr>
         <w:br/>
-        <w:t xml:space="preserve">- Designed and implemented highly interactive and responsive user interfaces using Next.js and </w:t>
+        <w:t xml:space="preserve">- Designed and implemented highly interactive and responsive user interfaces using </w:t>
+      </w:r>
+      <w:r>
+        <w:rPr>
+          <w:b/>
+          <w:bCs/>
+          <w:color w:val="000000" w:themeColor="text1"/>
+        </w:rPr>
+        <w:t>Next.js</w:t>
+      </w:r>
+      <w:r>
+        <w:rPr>
+          <w:color w:val="000000" w:themeColor="text1"/>
+        </w:rPr>
+        <w:t xml:space="preserve"> and </w:t>
       </w:r>
       <w:proofErr w:type="spellStart"/>
       <w:r>
         <w:rPr>
+          <w:b/>
+          <w:bCs/>
           <w:color w:val="000000" w:themeColor="text1"/>
         </w:rPr>
         <w:t>TailwindCSS</w:t>
@@ -490,7 +572,21 @@
           <w:color w:val="000000" w:themeColor="text1"/>
         </w:rPr>
         <w:br/>
-        <w:t xml:space="preserve">- Built scalable RESTful APIs consumed by Next.js frontend and mobile </w:t>
+        <w:t xml:space="preserve">- Built scalable </w:t>
+      </w:r>
+      <w:r>
+        <w:rPr>
+          <w:b/>
+          <w:bCs/>
+          <w:color w:val="000000" w:themeColor="text1"/>
+        </w:rPr>
+        <w:t>RESTful APIs</w:t>
+      </w:r>
+      <w:r>
+        <w:rPr>
+          <w:color w:val="000000" w:themeColor="text1"/>
+        </w:rPr>
+        <w:t xml:space="preserve"> consumed by Next.js frontend and mobile </w:t>
       </w:r>
       <w:r>
         <w:rPr>
@@ -509,7 +605,21 @@
           <w:color w:val="000000" w:themeColor="text1"/>
         </w:rPr>
         <w:br/>
-        <w:t>- Worked on integrating frontend with backend services for CRM, analytics, and investor management, ensuring seamless data flow and real-time analytics.</w:t>
+        <w:t xml:space="preserve">- Worked on integrating frontend with backend services for </w:t>
+      </w:r>
+      <w:r>
+        <w:rPr>
+          <w:b/>
+          <w:bCs/>
+          <w:color w:val="000000" w:themeColor="text1"/>
+        </w:rPr>
+        <w:t>CRM</w:t>
+      </w:r>
+      <w:r>
+        <w:rPr>
+          <w:color w:val="000000" w:themeColor="text1"/>
+        </w:rPr>
+        <w:t>, analytics, and investor management, ensuring seamless data flow and real-time analytics.</w:t>
       </w:r>
       <w:r>
         <w:rPr>
@@ -521,6 +631,8 @@
       <w:proofErr w:type="spellStart"/>
       <w:r>
         <w:rPr>
+          <w:b/>
+          <w:bCs/>
           <w:color w:val="000000" w:themeColor="text1"/>
         </w:rPr>
         <w:t>DaisyUI</w:t>
@@ -2416,7 +2528,6 @@
   <w:style w:type="character" w:default="1" w:styleId="DefaultParagraphFont">
     <w:name w:val="Default Paragraph Font"/>
     <w:uiPriority w:val="1"/>
-    <w:semiHidden/>
     <w:unhideWhenUsed/>
   </w:style>
   <w:style w:type="table" w:default="1" w:styleId="TableNormal">

</xml_diff>